<commit_message>
module-10/#milestone2.zip, module-10/Team Silver Rashai, Tyson, Crystal.doc, module-10/Team_Silver_cleaned_tables.sql, module-8/LongModule8.2.docx, module-8/~.2.docx, module-9/Outland_Adventures_2.py, and module-9/_.env
</commit_message>
<xml_diff>
--- a/module-8/LongModule8.2.docx
+++ b/module-8/LongModule8.2.docx
@@ -210,7 +210,11 @@
         </w:drawing>
       </w:r>
     </w:p>
-    <w:p/>
+    <w:p>
+      <w:r>
+        <w:t>https://github.com/KitsuneGakusei/CSD-310/tree/0fde6c02a0a1a0e165c9ae63f5ee41bbf5c61102/module-8</w:t>
+      </w:r>
+    </w:p>
     <w:sectPr>
       <w:pgSz w:w="12240" w:h="15840"/>
       <w:pgMar w:top="360" w:right="360" w:bottom="360" w:left="360" w:header="720" w:footer="720" w:gutter="0"/>

</xml_diff>